<commit_message>
final edit for the word
</commit_message>
<xml_diff>
--- a/report/lab5.pdf.docx
+++ b/report/lab5.pdf.docx
@@ -1444,21 +1444,32 @@
     </w:p>
     <w:p>
       <w:pPr>
-        <w:ind w:left="0" w:firstLine="351"/>
-      </w:pPr>
-    </w:p>
-    <w:p>
-      <w:pPr>
-        <w:ind w:left="0" w:firstLine="351"/>
+        <w:ind w:left="0" w:firstLine="0"/>
+      </w:pPr>
+    </w:p>
+    <w:p>
+      <w:pPr>
+        <w:ind w:left="0" w:firstLine="0"/>
       </w:pPr>
       <w:r>
         <w:t xml:space="preserve">GitHub Link for the Lab: </w:t>
       </w:r>
+      <w:r>
+        <w:t xml:space="preserve"> </w:t>
+      </w:r>
+      <w:hyperlink r:id="rId11" w:history="1">
+        <w:r>
+          <w:rPr>
+            <w:rStyle w:val="Hyperlink"/>
+          </w:rPr>
+          <w:t>MohammedAlJamal10/lab5: K-Nearest Neighbors Digit Classification</w:t>
+        </w:r>
+      </w:hyperlink>
     </w:p>
     <w:sectPr>
-      <w:footerReference w:type="even" r:id="rId11"/>
-      <w:footerReference w:type="default" r:id="rId12"/>
-      <w:footerReference w:type="first" r:id="rId13"/>
+      <w:footerReference w:type="even" r:id="rId12"/>
+      <w:footerReference w:type="default" r:id="rId13"/>
+      <w:footerReference w:type="first" r:id="rId14"/>
       <w:pgSz w:w="11906" w:h="16838"/>
       <w:pgMar w:top="1492" w:right="1440" w:bottom="1699" w:left="1440" w:header="720" w:footer="720" w:gutter="0"/>
       <w:pgNumType w:start="0"/>
@@ -3140,7 +3151,6 @@
   <w:style w:type="character" w:default="1" w:styleId="DefaultParagraphFont">
     <w:name w:val="Default Paragraph Font"/>
     <w:uiPriority w:val="1"/>
-    <w:semiHidden/>
     <w:unhideWhenUsed/>
   </w:style>
   <w:style w:type="table" w:default="1" w:styleId="TableNormal">
@@ -3192,6 +3202,29 @@
       <w:b/>
       <w:color w:val="003366"/>
       <w:sz w:val="50"/>
+    </w:rPr>
+  </w:style>
+  <w:style w:type="character" w:styleId="Hyperlink">
+    <w:name w:val="Hyperlink"/>
+    <w:basedOn w:val="DefaultParagraphFont"/>
+    <w:uiPriority w:val="99"/>
+    <w:unhideWhenUsed/>
+    <w:rsid w:val="00430108"/>
+    <w:rPr>
+      <w:color w:val="467886" w:themeColor="hyperlink"/>
+      <w:u w:val="single"/>
+    </w:rPr>
+  </w:style>
+  <w:style w:type="character" w:styleId="UnresolvedMention">
+    <w:name w:val="Unresolved Mention"/>
+    <w:basedOn w:val="DefaultParagraphFont"/>
+    <w:uiPriority w:val="99"/>
+    <w:semiHidden/>
+    <w:unhideWhenUsed/>
+    <w:rsid w:val="00430108"/>
+    <w:rPr>
+      <w:color w:val="605E5C"/>
+      <w:shd w:val="clear" w:color="auto" w:fill="E1DFDD"/>
     </w:rPr>
   </w:style>
 </w:styles>

</xml_diff>